<commit_message>
Started new template and interview. Getting error message that it cannot define guardians.address
</commit_message>
<xml_diff>
--- a/docassemble/DeAhcd/data/templates/de_ahcd_next_steps.docx
+++ b/docassemble/DeAhcd/data/templates/de_ahcd_next_steps.docx
@@ -34,7 +34,7 @@
               <w:rPr>
                 <w:color w:val="FFFFFF" w:themeColor="background1"/>
               </w:rPr>
-              <w:t xml:space="preserve">Get a Delaware Advance Health Care Directive</w:t>
+              <w:t xml:space="preserve">Create an Advance Health Care Directive in Delaware</w:t>
             </w:r>
           </w:p>
         </w:tc>
@@ -56,10 +56,10 @@
         <w:t>{{ users }}</w:t>
       </w:r>
       <w:r>
-        <w:t xml:space="preserve">! You have finished all the forms you need to Get a Delaware Advance Health Care Directive. The rest of the pages in t</w:t>
-      </w:r>
-      <w:r>
-        <w:t xml:space="preserve">his packet are your completed .</w:t>
+        <w:t xml:space="preserve">! You have finished all the forms you need to Create an Advance Health Care Directive in Delaware. The rest of the pages in t</w:t>
+      </w:r>
+      <w:r>
+        <w:t xml:space="preserve">his packet are your completed document.</w:t>
       </w:r>
     </w:p>
     <w:p/>
@@ -390,6 +390,23 @@
       <w:bookmarkEnd w:id="5"/>
       <w:r>
         <w:t xml:space="preserve">Learn more</w:t>
+      </w:r>
+    </w:p>
+    <w:p>
+      <w:pPr>
+        <w:keepNext/>
+        <w:rPr>
+          <w:b/>
+        </w:rPr>
+      </w:pPr>
+      <w:r>
+        <w:t xml:space="preserve">Visit </w:t>
+      </w:r>
+      <w:r>
+        <w:rPr>
+          <w:b/>
+        </w:rPr>
+        <w:t xml:space="preserve"/>
       </w:r>
     </w:p>
     <w:sectPr>

</xml_diff>